<commit_message>
Corrigir número de página que corrompia o .docx no Word
O rodapé montava o campo de número de página com `new PageNumberElement()`
como filho direto do parágrafo, irmão do TextRun de texto. A lib docx só
aceita PageNumberElement dentro de `children` de um TextRun — isso gerava
`<w:pgNum/>` fora de um `<w:r>` no XML, o que é válido como XML mas viola o
schema do Word (CT_P), fazendo o Word recusar o arquivo com "Erro no Word
ao tentar abrir o arquivo" (isso passava despercebido em validadores mais
tolerantes como textutil/python-docx, que ignoram o elemento malposicionado).

Reproduzi o erro isolando o padrão antigo e abrindo no Word (mesmo diálogo
relatado), e confirmei a correção com o mesmo teste. Regenerei o .docx de
exemplo em exemplos/ com o gerador corrigido.

Co-Authored-By: Claude Sonnet 5 <noreply@anthropic.com>
</commit_message>
<xml_diff>
--- a/exemplos/Relatorio_Construtora_Alfa_Julho_2026.docx
+++ b/exemplos/Relatorio_Construtora_Alfa_Julho_2026.docx
@@ -111,7 +111,7 @@
                 <w:sz w:val="19"/>
                 <w:szCs w:val="19"/>
               </w:rPr>
-              <w:t xml:space="preserve">Gerado em 15 de julho de 2026</w:t>
+              <w:t xml:space="preserve">Gerado em 17 de julho de 2026</w:t>
             </w:r>
           </w:p>
         </w:tc>
@@ -3056,8 +3056,8 @@
         <w:szCs w:val="13"/>
       </w:rPr>
       <w:t xml:space="preserve">   —   Página </w:t>
+      <w:pgNum/>
     </w:r>
-    <w:pgNum/>
   </w:p>
 </w:ftr>
 </file>

</xml_diff>